<commit_message>
feat: mejoras operativas, web push y metricas en panel admin
</commit_message>
<xml_diff>
--- a/backend/src/main/resources/templates/CARTA RESIDENCIA SISBEN.docx
+++ b/backend/src/main/resources/templates/CARTA RESIDENCIA SISBEN.docx
@@ -304,7 +304,7 @@
           <w:rFonts w:ascii="Maven Pro" w:hAnsi="Maven Pro" w:cs="Arial"/>
           <w:sz w:val="24"/>
         </w:rPr>
-        <w:t xml:space="preserve">,  a los </w:t>
+        <w:t xml:space="preserve">, a los </w:t>
       </w:r>
       <w:r>
         <w:rPr>
@@ -736,7 +736,25 @@
                 <w:sz w:val="16"/>
                 <w:szCs w:val="16"/>
               </w:rPr>
-              <w:t>; Secretaria Ejecutiva del Despacho</w:t>
+              <w:t xml:space="preserve">; </w:t>
+            </w:r>
+            <w:proofErr w:type="gramStart"/>
+            <w:r>
+              <w:rPr>
+                <w:rFonts w:ascii="Maven Pro" w:hAnsi="Maven Pro" w:cs="Tahoma"/>
+                <w:sz w:val="16"/>
+                <w:szCs w:val="16"/>
+              </w:rPr>
+              <w:t>Secretaria Ejecutiva</w:t>
+            </w:r>
+            <w:proofErr w:type="gramEnd"/>
+            <w:r>
+              <w:rPr>
+                <w:rFonts w:ascii="Maven Pro" w:hAnsi="Maven Pro" w:cs="Tahoma"/>
+                <w:sz w:val="16"/>
+                <w:szCs w:val="16"/>
+              </w:rPr>
+              <w:t xml:space="preserve"> del Despacho</w:t>
             </w:r>
           </w:p>
         </w:tc>
@@ -768,7 +786,25 @@
                 <w:sz w:val="16"/>
                 <w:szCs w:val="16"/>
               </w:rPr>
-              <w:t>; Secretaria Ejecutiva de Despacho</w:t>
+              <w:t xml:space="preserve">; </w:t>
+            </w:r>
+            <w:proofErr w:type="gramStart"/>
+            <w:r>
+              <w:rPr>
+                <w:rFonts w:ascii="Maven Pro" w:hAnsi="Maven Pro" w:cs="Tahoma"/>
+                <w:sz w:val="16"/>
+                <w:szCs w:val="16"/>
+              </w:rPr>
+              <w:t>Secretaria Ejecutiva</w:t>
+            </w:r>
+            <w:proofErr w:type="gramEnd"/>
+            <w:r>
+              <w:rPr>
+                <w:rFonts w:ascii="Maven Pro" w:hAnsi="Maven Pro" w:cs="Tahoma"/>
+                <w:sz w:val="16"/>
+                <w:szCs w:val="16"/>
+              </w:rPr>
+              <w:t xml:space="preserve"> de Despacho</w:t>
             </w:r>
           </w:p>
         </w:tc>
@@ -804,13 +840,23 @@
             </w:r>
             <w:bookmarkStart w:id="1" w:name="_Hlk190792217"/>
             <w:bookmarkEnd w:id="1"/>
+            <w:proofErr w:type="gramStart"/>
             <w:r>
               <w:rPr>
                 <w:rFonts w:ascii="Maven Pro" w:hAnsi="Maven Pro" w:cs="Tahoma"/>
                 <w:sz w:val="16"/>
                 <w:szCs w:val="16"/>
               </w:rPr>
-              <w:t>Alcalde Municipal</w:t>
+              <w:t>Alcalde</w:t>
+            </w:r>
+            <w:proofErr w:type="gramEnd"/>
+            <w:r>
+              <w:rPr>
+                <w:rFonts w:ascii="Maven Pro" w:hAnsi="Maven Pro" w:cs="Tahoma"/>
+                <w:sz w:val="16"/>
+                <w:szCs w:val="16"/>
+              </w:rPr>
+              <w:t xml:space="preserve"> Municipal</w:t>
             </w:r>
           </w:p>
         </w:tc>
@@ -2675,7 +2721,25 @@
         <w:sz w:val="18"/>
         <w:szCs w:val="18"/>
       </w:rPr>
-      <w:t>100-«consecutivo»</w:t>
+      <w:t>100</w:t>
+    </w:r>
+    <w:proofErr w:type="gramStart"/>
+    <w:r>
+      <w:rPr>
+        <w:rFonts w:ascii="Maven Pro" w:hAnsi="Maven Pro"/>
+        <w:sz w:val="18"/>
+        <w:szCs w:val="18"/>
+      </w:rPr>
+      <w:t>-«</w:t>
+    </w:r>
+    <w:proofErr w:type="gramEnd"/>
+    <w:r>
+      <w:rPr>
+        <w:rFonts w:ascii="Maven Pro" w:hAnsi="Maven Pro"/>
+        <w:sz w:val="18"/>
+        <w:szCs w:val="18"/>
+      </w:rPr>
+      <w:t>consecutivo»</w:t>
     </w:r>
   </w:p>
 </w:hdr>
@@ -3394,7 +3458,25 @@
         <w:sz w:val="18"/>
         <w:szCs w:val="18"/>
       </w:rPr>
-      <w:t>100-«consecutivo»</w:t>
+      <w:t>100</w:t>
+    </w:r>
+    <w:proofErr w:type="gramStart"/>
+    <w:r>
+      <w:rPr>
+        <w:rFonts w:ascii="Maven Pro" w:hAnsi="Maven Pro"/>
+        <w:sz w:val="18"/>
+        <w:szCs w:val="18"/>
+      </w:rPr>
+      <w:t>-«</w:t>
+    </w:r>
+    <w:proofErr w:type="gramEnd"/>
+    <w:r>
+      <w:rPr>
+        <w:rFonts w:ascii="Maven Pro" w:hAnsi="Maven Pro"/>
+        <w:sz w:val="18"/>
+        <w:szCs w:val="18"/>
+      </w:rPr>
+      <w:t>consecutivo»</w:t>
     </w:r>
   </w:p>
 </w:hdr>
@@ -3936,6 +4018,7 @@
   <w:style w:type="character" w:default="1" w:styleId="Fuentedeprrafopredeter">
     <w:name w:val="Default Paragraph Font"/>
     <w:uiPriority w:val="1"/>
+    <w:semiHidden/>
     <w:unhideWhenUsed/>
   </w:style>
   <w:style w:type="table" w:default="1" w:styleId="Tablanormal">
@@ -6948,10 +7031,6 @@
 </file>
 
 <file path=customXml/item1.xml><?xml version="1.0" encoding="utf-8"?>
-<b:Sources xmlns:b="http://schemas.openxmlformats.org/officeDocument/2006/bibliography" xmlns="http://schemas.openxmlformats.org/officeDocument/2006/bibliography" SelectedStyle="\APASixthEditionOfficeOnline.xsl" StyleName="APA" Version="6"/>
-</file>
-
-<file path=customXml/item2.xml><?xml version="1.0" encoding="utf-8"?>
 <s:customData xmlns="http://www.wps.cn/officeDocument/2013/wpsCustomData" xmlns:s="http://www.wps.cn/officeDocument/2013/wpsCustomData">
   <customSectProps/>
   <customShpExts>
@@ -6960,18 +7039,22 @@
 </s:customData>
 </file>
 
+<file path=customXml/item2.xml><?xml version="1.0" encoding="utf-8"?>
+<b:Sources xmlns:b="http://schemas.openxmlformats.org/officeDocument/2006/bibliography" xmlns="http://schemas.openxmlformats.org/officeDocument/2006/bibliography" SelectedStyle="\APASixthEditionOfficeOnline.xsl" StyleName="APA" Version="6"/>
+</file>
+
 <file path=customXml/itemProps1.xml><?xml version="1.0" encoding="utf-8"?>
+<ds:datastoreItem xmlns:ds="http://schemas.openxmlformats.org/officeDocument/2006/customXml" ds:itemID="{B1977F7D-205B-4081-913C-38D41E755F92}">
+  <ds:schemaRefs>
+    <ds:schemaRef ds:uri="http://www.wps.cn/officeDocument/2013/wpsCustomData"/>
+  </ds:schemaRefs>
+</ds:datastoreItem>
+</file>
+
+<file path=customXml/itemProps2.xml><?xml version="1.0" encoding="utf-8"?>
 <ds:datastoreItem xmlns:ds="http://schemas.openxmlformats.org/officeDocument/2006/customXml" ds:itemID="{57A9E1C8-2F74-4495-A02D-86D169A6004A}">
   <ds:schemaRefs>
     <ds:schemaRef ds:uri="http://schemas.openxmlformats.org/officeDocument/2006/bibliography"/>
   </ds:schemaRefs>
 </ds:datastoreItem>
-</file>
-
-<file path=customXml/itemProps2.xml><?xml version="1.0" encoding="utf-8"?>
-<ds:datastoreItem xmlns:ds="http://schemas.openxmlformats.org/officeDocument/2006/customXml" ds:itemID="{B1977F7D-205B-4081-913C-38D41E755F92}">
-  <ds:schemaRefs>
-    <ds:schemaRef ds:uri="http://www.wps.cn/officeDocument/2013/wpsCustomData"/>
-  </ds:schemaRefs>
-</ds:datastoreItem>
 </file>
</xml_diff>